<commit_message>
fix: Shablonlardagi Microsoft Word tomonidan yashiringan teglarni script yordamida tozalash va to'liq avtomatlashtirilgan docxtemplater ulanishi
</commit_message>
<xml_diff>
--- a/dashboard-app/documents/templates/Da'vo ariza.docx
+++ b/dashboard-app/documents/templates/Da'vo ariza.docx
@@ -537,7 +537,7 @@
                 <w:sz w:val="28"/>
                 <w:lang w:val="en-US"/>
               </w:rPr>
-              <w:t xml:space="preserve">KADIROV ODIL MURATOVICH </w:t>
+              <w:t xml:space="preserve">{FISH} </w:t>
             </w:r>
           </w:p>
           <w:p>
@@ -570,181 +570,7 @@
                 <w:sz w:val="28"/>
                 <w:lang w:val="en-US"/>
               </w:rPr>
-              <w:t xml:space="preserve">Toshkent </w:t>
-            </w:r>
-            <w:proofErr w:type="spellStart"/>
-            <w:r>
-              <w:rPr>
-                <w:rFonts w:ascii="Times New Roman" w:hAnsi="Times New Roman"/>
-                <w:i/>
-                <w:iCs/>
-                <w:sz w:val="28"/>
-                <w:lang w:val="en-US"/>
-              </w:rPr>
-              <w:t>shahri</w:t>
-            </w:r>
-            <w:proofErr w:type="spellEnd"/>
-            <w:r>
-              <w:rPr>
-                <w:rFonts w:ascii="Times New Roman" w:hAnsi="Times New Roman"/>
-                <w:i/>
-                <w:iCs/>
-                <w:sz w:val="28"/>
-                <w:lang w:val="en-US"/>
-              </w:rPr>
-              <w:t xml:space="preserve">, </w:t>
-            </w:r>
-            <w:proofErr w:type="spellStart"/>
-            <w:r>
-              <w:rPr>
-                <w:rFonts w:ascii="Times New Roman" w:hAnsi="Times New Roman"/>
-                <w:i/>
-                <w:iCs/>
-                <w:sz w:val="28"/>
-                <w:lang w:val="en-US"/>
-              </w:rPr>
-              <w:t>Uchtepa</w:t>
-            </w:r>
-            <w:proofErr w:type="spellEnd"/>
-            <w:r>
-              <w:rPr>
-                <w:rFonts w:ascii="Times New Roman" w:hAnsi="Times New Roman"/>
-                <w:i/>
-                <w:iCs/>
-                <w:sz w:val="28"/>
-                <w:lang w:val="en-US"/>
-              </w:rPr>
-              <w:t xml:space="preserve"> </w:t>
-            </w:r>
-            <w:proofErr w:type="spellStart"/>
-            <w:r>
-              <w:rPr>
-                <w:rFonts w:ascii="Times New Roman" w:hAnsi="Times New Roman"/>
-                <w:i/>
-                <w:iCs/>
-                <w:sz w:val="28"/>
-                <w:lang w:val="en-US"/>
-              </w:rPr>
-              <w:t>tumani</w:t>
-            </w:r>
-            <w:proofErr w:type="spellEnd"/>
-            <w:r>
-              <w:rPr>
-                <w:rFonts w:ascii="Times New Roman" w:hAnsi="Times New Roman"/>
-                <w:i/>
-                <w:iCs/>
-                <w:sz w:val="28"/>
-                <w:lang w:val="en-US"/>
-              </w:rPr>
-              <w:t xml:space="preserve">, </w:t>
-            </w:r>
-            <w:proofErr w:type="spellStart"/>
-            <w:r>
-              <w:rPr>
-                <w:rFonts w:ascii="Times New Roman" w:hAnsi="Times New Roman"/>
-                <w:i/>
-                <w:iCs/>
-                <w:sz w:val="28"/>
-                <w:lang w:val="en-US"/>
-              </w:rPr>
-              <w:t>Jurjoniy</w:t>
-            </w:r>
-            <w:proofErr w:type="spellEnd"/>
-            <w:r>
-              <w:rPr>
-                <w:rFonts w:ascii="Times New Roman" w:hAnsi="Times New Roman"/>
-                <w:i/>
-                <w:iCs/>
-                <w:sz w:val="28"/>
-                <w:lang w:val="en-US"/>
-              </w:rPr>
-              <w:t xml:space="preserve"> MFY, </w:t>
-            </w:r>
-            <w:proofErr w:type="spellStart"/>
-            <w:r>
-              <w:rPr>
-                <w:rFonts w:ascii="Times New Roman" w:hAnsi="Times New Roman"/>
-                <w:i/>
-                <w:iCs/>
-                <w:sz w:val="28"/>
-                <w:lang w:val="en-US"/>
-              </w:rPr>
-              <w:t>Zamaxshariy</w:t>
-            </w:r>
-            <w:proofErr w:type="spellEnd"/>
-            <w:r>
-              <w:rPr>
-                <w:rFonts w:ascii="Times New Roman" w:hAnsi="Times New Roman"/>
-                <w:i/>
-                <w:iCs/>
-                <w:sz w:val="28"/>
-                <w:lang w:val="en-US"/>
-              </w:rPr>
-              <w:t xml:space="preserve"> </w:t>
-            </w:r>
-            <w:proofErr w:type="spellStart"/>
-            <w:proofErr w:type="gramStart"/>
-            <w:r>
-              <w:rPr>
-                <w:rFonts w:ascii="Times New Roman" w:hAnsi="Times New Roman"/>
-                <w:i/>
-                <w:iCs/>
-                <w:sz w:val="28"/>
-                <w:lang w:val="en-US"/>
-              </w:rPr>
-              <w:t>ko</w:t>
-            </w:r>
-            <w:r>
-              <w:rPr>
-                <w:rFonts w:ascii="Times New Roman" w:hAnsi="Times New Roman"/>
-                <w:i/>
-                <w:iCs/>
-                <w:sz w:val="28"/>
-                <w:lang w:val="en-US"/>
-              </w:rPr>
-              <w:t>‘</w:t>
-            </w:r>
-            <w:proofErr w:type="gramEnd"/>
-            <w:r>
-              <w:rPr>
-                <w:rFonts w:ascii="Times New Roman" w:hAnsi="Times New Roman"/>
-                <w:i/>
-                <w:iCs/>
-                <w:sz w:val="28"/>
-                <w:lang w:val="en-US"/>
-              </w:rPr>
-              <w:t>chasi</w:t>
-            </w:r>
-            <w:proofErr w:type="spellEnd"/>
-            <w:r>
-              <w:rPr>
-                <w:rFonts w:ascii="Times New Roman" w:hAnsi="Times New Roman"/>
-                <w:i/>
-                <w:iCs/>
-                <w:sz w:val="28"/>
-                <w:lang w:val="en-US"/>
-              </w:rPr>
-              <w:t xml:space="preserve"> </w:t>
-            </w:r>
-            <w:r>
-              <w:rPr>
-                <w:rFonts w:ascii="Times New Roman" w:hAnsi="Times New Roman"/>
-                <w:i/>
-                <w:iCs/>
-                <w:sz w:val="28"/>
-                <w:lang w:val="en-US"/>
-              </w:rPr>
-              <w:br/>
-            </w:r>
-            <w:r>
-              <w:rPr>
-                <w:rFonts w:ascii="Times New Roman" w:hAnsi="Times New Roman"/>
-                <w:i/>
-                <w:iCs/>
-                <w:sz w:val="28"/>
-                <w:lang w:val="en-US"/>
-              </w:rPr>
-              <w:t>30-uy</w:t>
+              <w:t xml:space="preserve">{MANZIL}</w:t>
             </w:r>
             <w:r>
               <w:rPr>
@@ -870,23 +696,7 @@
                 <w:sz w:val="28"/>
                 <w:lang w:val="en-US"/>
               </w:rPr>
-              <w:t>AD</w:t>
-            </w:r>
-            <w:r>
-              <w:rPr>
-                <w:rFonts w:ascii="Times New Roman" w:hAnsi="Times New Roman"/>
-                <w:sz w:val="28"/>
-                <w:lang w:val="en-US"/>
-              </w:rPr>
-              <w:t xml:space="preserve"> </w:t>
-            </w:r>
-            <w:r>
-              <w:rPr>
-                <w:rFonts w:ascii="Times New Roman" w:hAnsi="Times New Roman"/>
-                <w:sz w:val="28"/>
-                <w:lang w:val="en-US"/>
-              </w:rPr>
-              <w:t>1114901</w:t>
+              <w:t>{PASPORT}</w:t>
             </w:r>
           </w:p>
           <w:p>
@@ -911,7 +721,7 @@
                 <w:rFonts w:ascii="Times New Roman" w:hAnsi="Times New Roman"/>
                 <w:sz w:val="28"/>
               </w:rPr>
-              <w:t>: 31602870171169</w:t>
+              <w:t>: {JSHSHIR}</w:t>
             </w:r>
           </w:p>
         </w:tc>
@@ -1205,7 +1015,7 @@
           <w:sz w:val="28"/>
           <w:lang w:val="en-US"/>
         </w:rPr>
-        <w:t xml:space="preserve"> KADIROV ODIL MURATOVICH</w:t>
+        <w:t xml:space="preserve"> {FISH}</w:t>
       </w:r>
       <w:r>
         <w:rPr>
@@ -4012,235 +3822,7 @@
           <w:sz w:val="28"/>
           <w:lang w:val="en-US"/>
         </w:rPr>
-        <w:t xml:space="preserve"> 22 863 280</w:t>
-      </w:r>
-      <w:r>
-        <w:rPr>
-          <w:rFonts w:ascii="Times New Roman" w:hAnsi="Times New Roman"/>
-          <w:i/>
-          <w:sz w:val="28"/>
-          <w:lang w:val="en-US"/>
-        </w:rPr>
-        <w:t xml:space="preserve"> (</w:t>
-      </w:r>
-      <w:proofErr w:type="spellStart"/>
-      <w:r>
-        <w:rPr>
-          <w:rFonts w:ascii="Times New Roman" w:hAnsi="Times New Roman"/>
-          <w:i/>
-          <w:sz w:val="28"/>
-          <w:lang w:val="en-US"/>
-        </w:rPr>
-        <w:t>yigirma</w:t>
-      </w:r>
-      <w:proofErr w:type="spellEnd"/>
-      <w:r>
-        <w:rPr>
-          <w:rFonts w:ascii="Times New Roman" w:hAnsi="Times New Roman"/>
-          <w:i/>
-          <w:sz w:val="28"/>
-          <w:lang w:val="en-US"/>
-        </w:rPr>
-        <w:t xml:space="preserve"> </w:t>
-      </w:r>
-      <w:proofErr w:type="spellStart"/>
-      <w:r>
-        <w:rPr>
-          <w:rFonts w:ascii="Times New Roman" w:hAnsi="Times New Roman"/>
-          <w:i/>
-          <w:sz w:val="28"/>
-          <w:lang w:val="en-US"/>
-        </w:rPr>
-        <w:t>ikki</w:t>
-      </w:r>
-      <w:proofErr w:type="spellEnd"/>
-      <w:r>
-        <w:rPr>
-          <w:rFonts w:ascii="Times New Roman" w:hAnsi="Times New Roman"/>
-          <w:i/>
-          <w:sz w:val="28"/>
-          <w:lang w:val="en-US"/>
-        </w:rPr>
-        <w:t xml:space="preserve"> million </w:t>
-      </w:r>
-      <w:proofErr w:type="spellStart"/>
-      <w:r>
-        <w:rPr>
-          <w:rFonts w:ascii="Times New Roman" w:hAnsi="Times New Roman"/>
-          <w:i/>
-          <w:sz w:val="28"/>
-          <w:lang w:val="en-US"/>
-        </w:rPr>
-        <w:t>sakkiz</w:t>
-      </w:r>
-      <w:proofErr w:type="spellEnd"/>
-      <w:r>
-        <w:rPr>
-          <w:rFonts w:ascii="Times New Roman" w:hAnsi="Times New Roman"/>
-          <w:i/>
-          <w:sz w:val="28"/>
-          <w:lang w:val="en-US"/>
-        </w:rPr>
-        <w:t xml:space="preserve"> </w:t>
-      </w:r>
-      <w:proofErr w:type="spellStart"/>
-      <w:r>
-        <w:rPr>
-          <w:rFonts w:ascii="Times New Roman" w:hAnsi="Times New Roman"/>
-          <w:i/>
-          <w:sz w:val="28"/>
-          <w:lang w:val="en-US"/>
-        </w:rPr>
-        <w:t>yuz</w:t>
-      </w:r>
-      <w:proofErr w:type="spellEnd"/>
-      <w:r>
-        <w:rPr>
-          <w:rFonts w:ascii="Times New Roman" w:hAnsi="Times New Roman"/>
-          <w:i/>
-          <w:sz w:val="28"/>
-          <w:lang w:val="en-US"/>
-        </w:rPr>
-        <w:t xml:space="preserve"> </w:t>
-      </w:r>
-      <w:proofErr w:type="spellStart"/>
-      <w:r>
-        <w:rPr>
-          <w:rFonts w:ascii="Times New Roman" w:hAnsi="Times New Roman"/>
-          <w:i/>
-          <w:sz w:val="28"/>
-          <w:lang w:val="en-US"/>
-        </w:rPr>
-        <w:t>oltmish</w:t>
-      </w:r>
-      <w:proofErr w:type="spellEnd"/>
-      <w:r>
-        <w:rPr>
-          <w:rFonts w:ascii="Times New Roman" w:hAnsi="Times New Roman"/>
-          <w:i/>
-          <w:sz w:val="28"/>
-          <w:lang w:val="en-US"/>
-        </w:rPr>
-        <w:t xml:space="preserve"> </w:t>
-      </w:r>
-      <w:proofErr w:type="spellStart"/>
-      <w:r>
-        <w:rPr>
-          <w:rFonts w:ascii="Times New Roman" w:hAnsi="Times New Roman"/>
-          <w:i/>
-          <w:sz w:val="28"/>
-          <w:lang w:val="en-US"/>
-        </w:rPr>
-        <w:t>uch</w:t>
-      </w:r>
-      <w:proofErr w:type="spellEnd"/>
-      <w:r>
-        <w:rPr>
-          <w:rFonts w:ascii="Times New Roman" w:hAnsi="Times New Roman"/>
-          <w:i/>
-          <w:sz w:val="28"/>
-          <w:lang w:val="en-US"/>
-        </w:rPr>
-        <w:t xml:space="preserve"> </w:t>
-      </w:r>
-      <w:proofErr w:type="spellStart"/>
-      <w:r>
-        <w:rPr>
-          <w:rFonts w:ascii="Times New Roman" w:hAnsi="Times New Roman"/>
-          <w:i/>
-          <w:sz w:val="28"/>
-          <w:lang w:val="en-US"/>
-        </w:rPr>
-        <w:t>ming</w:t>
-      </w:r>
-      <w:proofErr w:type="spellEnd"/>
-      <w:r>
-        <w:rPr>
-          <w:rFonts w:ascii="Times New Roman" w:hAnsi="Times New Roman"/>
-          <w:i/>
-          <w:sz w:val="28"/>
-          <w:lang w:val="en-US"/>
-        </w:rPr>
-        <w:t xml:space="preserve"> </w:t>
-      </w:r>
-      <w:proofErr w:type="spellStart"/>
-      <w:r>
-        <w:rPr>
-          <w:rFonts w:ascii="Times New Roman" w:hAnsi="Times New Roman"/>
-          <w:i/>
-          <w:sz w:val="28"/>
-          <w:lang w:val="en-US"/>
-        </w:rPr>
-        <w:t>ikki</w:t>
-      </w:r>
-      <w:proofErr w:type="spellEnd"/>
-      <w:r>
-        <w:rPr>
-          <w:rFonts w:ascii="Times New Roman" w:hAnsi="Times New Roman"/>
-          <w:i/>
-          <w:sz w:val="28"/>
-          <w:lang w:val="en-US"/>
-        </w:rPr>
-        <w:t xml:space="preserve"> </w:t>
-      </w:r>
-      <w:proofErr w:type="spellStart"/>
-      <w:r>
-        <w:rPr>
-          <w:rFonts w:ascii="Times New Roman" w:hAnsi="Times New Roman"/>
-          <w:i/>
-          <w:sz w:val="28"/>
-          <w:lang w:val="en-US"/>
-        </w:rPr>
-        <w:t>yuz</w:t>
-      </w:r>
-      <w:proofErr w:type="spellEnd"/>
-      <w:r>
-        <w:rPr>
-          <w:rFonts w:ascii="Times New Roman" w:hAnsi="Times New Roman"/>
-          <w:i/>
-          <w:sz w:val="28"/>
-          <w:lang w:val="en-US"/>
-        </w:rPr>
-        <w:t xml:space="preserve"> </w:t>
-      </w:r>
-      <w:proofErr w:type="spellStart"/>
-      <w:r>
-        <w:rPr>
-          <w:rFonts w:ascii="Times New Roman" w:hAnsi="Times New Roman"/>
-          <w:i/>
-          <w:sz w:val="28"/>
-          <w:lang w:val="en-US"/>
-        </w:rPr>
-        <w:t>sakson</w:t>
-      </w:r>
-      <w:proofErr w:type="spellEnd"/>
-      <w:r>
-        <w:rPr>
-          <w:rFonts w:ascii="Times New Roman" w:hAnsi="Times New Roman"/>
-          <w:i/>
-          <w:sz w:val="28"/>
-          <w:lang w:val="en-US"/>
-        </w:rPr>
-        <w:t>)</w:t>
-      </w:r>
-      <w:r>
-        <w:rPr>
-          <w:rFonts w:ascii="Times New Roman" w:hAnsi="Times New Roman"/>
-          <w:iCs/>
-          <w:sz w:val="28"/>
-          <w:lang w:val="en-US"/>
-        </w:rPr>
-        <w:t xml:space="preserve"> </w:t>
-      </w:r>
-      <w:proofErr w:type="spellStart"/>
-      <w:r>
-        <w:rPr>
-          <w:rFonts w:ascii="Times New Roman" w:hAnsi="Times New Roman"/>
-          <w:iCs/>
-          <w:sz w:val="28"/>
-          <w:lang w:val="en-US"/>
-        </w:rPr>
-        <w:t>so‘m</w:t>
+        <w:t xml:space="preserve"> {QARZ_QOLDIQ} ({QOLDIQ_SOZ}) so'm</w:t>
       </w:r>
       <w:proofErr w:type="spellEnd"/>
       <w:r>
@@ -9723,18 +9305,7 @@
           <w:sz w:val="28"/>
           <w:lang w:val="en-US"/>
         </w:rPr>
-        <w:t xml:space="preserve"> KADIROV ODIL </w:t>
-      </w:r>
-      <w:proofErr w:type="spellStart"/>
-      <w:r>
-        <w:rPr>
-          <w:rFonts w:ascii="Times New Roman" w:hAnsi="Times New Roman"/>
-          <w:bCs/>
-          <w:color w:val="000000"/>
-          <w:sz w:val="28"/>
-          <w:lang w:val="en-US"/>
-        </w:rPr>
-        <w:t>MURATOVICHdan</w:t>
+        <w:t xml:space="preserve"> {FISH}dan</w:t>
       </w:r>
       <w:proofErr w:type="spellEnd"/>
       <w:r>

</xml_diff>